<commit_message>
docs: corrige contradições da auditoria (status em execução, v241 contenção pré-go-live, GP no PLA, horas 586/~624, T-39/T-19, CR AP separado 001+002, BL-HOTFIX, RF09->T-19)
Co-Authored-By: Claude Opus 4.8 (1M context) <noreply@anthropic.com>
</commit_message>
<xml_diff>
--- a/mps-nivel-c/oficial/04_registros/AASP_Andamento-Processuais/ATA-AASPAP01-001_Ata-Alinhamento-Fluxo-CNJ.docx
+++ b/mps-nivel-c/oficial/04_registros/AASP_Andamento-Processuais/ATA-AASPAP01-001_Ata-Alinhamento-Fluxo-CNJ.docx
@@ -2097,7 +2097,7 @@
           <w:i w:val="0"/>
           <w:sz w:val="22"/>
         </w:rPr>
-        <w:t>Revisado o andamento das Fases 3–4: webhook multi-fonte e movimentações entregues; foco no tratamento de erros por instância (campo Observacao), no controle de segredo de justiça por instância (campo Segredo, decisão D07) e na atualização do CodigoFonteAPI. Esse escopo adicional foi formalizado no CR-AASPAP01-001. Acordada a continuidade autônoma do time durante a ausência do gestor.</w:t>
+        <w:t>Revisado o andamento das Fases 3–4: webhook multi-fonte e movimentações entregues; foco no tratamento de erros por instância (campo Observacao), no controle de segredo de justiça por instância (campo Segredo, decisão D07) e na atualização do CodigoFonteAPI. Esse escopo adicional foi formalizado no CR-AASPAP01-002. Acordada a continuidade autônoma do time durante a ausência do gestor.</w:t>
       </w:r>
       <w:r>
         <w:rPr>
@@ -2392,7 +2392,7 @@
                 <w:i w:val="0"/>
                 <w:sz w:val="20"/>
               </w:rPr>
-              <w:t>Formalizar o escopo adicional da Fase 4 (CR-AASPAP01-001)</w:t>
+              <w:t>Formalizar o escopo adicional da Fase 4 (CR-AASPAP01-002)</w:t>
             </w:r>
           </w:p>
         </w:tc>

</xml_diff>

<commit_message>
docs(registros): espelha AASP_CNJ e AASP_AndamentosProcessuais da cnj_andamentos (fonte de verdade)
Sobrepõe as duas pastas de oficial/04_registros com o conteúdo atual da branch
cnj_andamentos, tratada como ponto de verdade:
- AASP_CNJ: adiciona CR-AASPCNJ01-002 e evidências (swagger/postman/devops/schemas),
  atualiza os 18 docx + GEST; remove os .md-fonte, o 00_INDICE e o CAP
  (Registro de Capacitação) por não existirem na fonte de verdade.
- AASP_AndamentosProcessuais: adiciona CR-AASPAP01-002 e atualiza 13 docx/planilha.

https://claude.ai/code/session_01D9YHKrGanfZsACSZKYQDTp
</commit_message>
<xml_diff>
--- a/mps-nivel-c/oficial/04_registros/AASP_Andamento-Processuais/ATA-AASPAP01-001_Ata-Alinhamento-Fluxo-CNJ.docx
+++ b/mps-nivel-c/oficial/04_registros/AASP_Andamento-Processuais/ATA-AASPAP01-001_Ata-Alinhamento-Fluxo-CNJ.docx
@@ -578,7 +578,7 @@
           <w:i w:val="0"/>
           <w:sz w:val="22"/>
         </w:rPr>
-        <w:t>Esta ata consolida o alinhamento técnico do fluxo (07/04/2026) e a revisão do fluxo com o time ampliado (08/05/2026).</w:t>
+        <w:t>Esta ata consolida o alinhamento técnico do fluxo (07/04/2026) e a revisão do fluxo com o time ampliado (08/05/2026), conforme o BLOCO 10 do levantamento do projeto.</w:t>
       </w:r>
     </w:p>
     <w:p>
@@ -2097,7 +2097,7 @@
           <w:i w:val="0"/>
           <w:sz w:val="22"/>
         </w:rPr>
-        <w:t>Revisado o andamento das Fases 3–4: webhook multi-fonte e movimentações entregues; foco no tratamento de erros por instância (campo Observacao), no controle de segredo de justiça por instância (campo Segredo, decisão D07) e na atualização do CodigoFonteAPI. Esse escopo adicional foi formalizado no CR-AASPAP01-001. Acordada a continuidade autônoma do time durante a ausência do gestor.</w:t>
+        <w:t>Revisado o andamento das Fases 3–4: webhook multi-fonte e movimentações entregues; foco no tratamento de erros por instância (campo Observacao), no controle de segredo de justiça por instância (campo Segredo, decisão D07) e na atualização do CodigoFonteAPI. Esse escopo adicional foi formalizado no CR-AASPAP01-002. Acordada a continuidade autônoma do time durante a ausência do gestor.</w:t>
       </w:r>
       <w:r>
         <w:rPr>
@@ -2392,7 +2392,7 @@
                 <w:i w:val="0"/>
                 <w:sz w:val="20"/>
               </w:rPr>
-              <w:t>Formalizar o escopo adicional da Fase 4 (CR-AASPAP01-001)</w:t>
+              <w:t>Formalizar o escopo adicional da Fase 4 (CR-AASPAP01-002)</w:t>
             </w:r>
           </w:p>
         </w:tc>
@@ -2802,7 +2802,7 @@
                 <w:i w:val="0"/>
                 <w:sz w:val="20"/>
               </w:rPr>
-              <w:t>Ata consolidando o alinhamento de 07/04/2026 e a revisão de 08/05/2026, reconstituída a partir da Planilha de Gestão GEST-AASPAP01 e do Registro de Projeto REG-AASPAP01-001.</w:t>
+              <w:t>Ata consolidando o alinhamento de 07/04/2026 e a revisão de 08/05/2026, reconstituída a partir da Planilha de Gestão GEST-AASPAP01 (14/06/2026, BLOCO 10) e do Registro de Projeto REG-AASPAP01-001.</w:t>
             </w:r>
           </w:p>
         </w:tc>

</xml_diff>

<commit_message>
docs(registros): ajustes de auditoria em AASP_CNJ e AASP_AndamentosProcessuais
AASP_AndamentosProcessuais:
- ATA: remove referências órfãs ao INTAKE/"BLOCO 10" e a data 14/06 na proveniência
- PCP: troca menção ao INTAKE por "registro do projeto"
- ITP: corrige rótulo do CR-002 (constava "homologação EPROC/ESAJ", que é escopo do CR-001)

AASP_CNJ:
- alinha o papel de Cézar (Tech Lead/DevOps/Arquiteto; GP = Abraão) em TAP/ATA/REQ/PCP
- corrige a data da reunião de alinhamento para 07/04/2026 em GDE e PCP
- CR-002: corrige o subtítulo (Versão 1.0)

https://claude.ai/code/session_01D9YHKrGanfZsACSZKYQDTp
</commit_message>
<xml_diff>
--- a/mps-nivel-c/oficial/04_registros/AASP_Andamento-Processuais/ATA-AASPAP01-001_Ata-Alinhamento-Fluxo-CNJ.docx
+++ b/mps-nivel-c/oficial/04_registros/AASP_Andamento-Processuais/ATA-AASPAP01-001_Ata-Alinhamento-Fluxo-CNJ.docx
@@ -578,7 +578,7 @@
           <w:i w:val="0"/>
           <w:sz w:val="22"/>
         </w:rPr>
-        <w:t>Esta ata consolida o alinhamento técnico do fluxo (07/04/2026) e a revisão do fluxo com o time ampliado (08/05/2026), conforme o BLOCO 10 do levantamento do projeto.</w:t>
+        <w:t>Esta ata consolida o alinhamento técnico do fluxo (07/04/2026) e a revisão do fluxo com o time ampliado (08/05/2026).</w:t>
       </w:r>
     </w:p>
     <w:p>
@@ -2802,7 +2802,7 @@
                 <w:i w:val="0"/>
                 <w:sz w:val="20"/>
               </w:rPr>
-              <w:t>Ata consolidando o alinhamento de 07/04/2026 e a revisão de 08/05/2026, reconstituída a partir da Planilha de Gestão GEST-AASPAP01 (14/06/2026, BLOCO 10) e do Registro de Projeto REG-AASPAP01-001.</w:t>
+              <w:t>Ata consolidando o alinhamento de 07/04/2026 e a revisão de 08/05/2026, reconstituída a partir da Planilha de Gestão GEST-AASPAP01 e do Registro de Projeto REG-AASPAP01-001.</w:t>
             </w:r>
           </w:p>
         </w:tc>

</xml_diff>